<commit_message>
Fill in author name and student ID on report title page and README
Co-Authored-By: Claude Opus 4.8 <noreply@anthropic.com>
Claude-Session: https://claude.ai/code/session_01EB2ZPE2QiQ55eFfxNJFpn5
</commit_message>
<xml_diff>
--- a/docs/MusicMind_Stage1_Report.docx
+++ b/docs/MusicMind_Stage1_Report.docx
@@ -72,7 +72,7 @@
           <w:sz w:val="22"/>
           <w:szCs w:val="22"/>
         </w:rPr>
-        <w:t xml:space="preserve">Author: Sarina [full name]        Student ID: [ ]</w:t>
+        <w:t xml:space="preserve">Author: Sarina Kavoli        Student ID: 220816757</w:t>
       </w:r>
     </w:p>
     <w:p>
@@ -85,7 +85,7 @@
           <w:sz w:val="22"/>
           <w:szCs w:val="22"/>
         </w:rPr>
-        <w:t xml:space="preserve">GitHub repository: [public repo URL]</w:t>
+        <w:t xml:space="preserve">GitHub repository: github.com/sarinakavoli/EECS3311-MusicMind</w:t>
       </w:r>
     </w:p>
     <w:p>

</xml_diff>